<commit_message>
After fix bugs at User Account Management
</commit_message>
<xml_diff>
--- a/Database/Create Database.docx
+++ b/Database/Create Database.docx
@@ -24,7 +24,13 @@
     </w:p>
     <w:p>
       <w:r>
-        <w:t xml:space="preserve">    AccountID NUMBER,</w:t>
+        <w:t xml:space="preserve">    AccountID NUMBER</w:t>
+      </w:r>
+      <w:r>
+        <w:t xml:space="preserve"> unique</w:t>
+      </w:r>
+      <w:r>
+        <w:t>,</w:t>
       </w:r>
     </w:p>
     <w:p>

</xml_diff>